<commit_message>
fix(templates): add page-number footers, right-align Amount, bold both total rows
Apply the harness's new footer/colAlign/boldRows capabilities to all four
docx reference generators and regenerate the binaries:

- All four packs get a centred page-number footer. business-report and
  proposal-sow have cover pages, so those two also suppress the number on
  page one; decision-memo and operations-guide have no cover, so the number
  starts on page one.
- proposal-sow's Commercials table right-aligns its Amount column (the only
  numeric column), matching what its THEME.md already promised.
- business-report's Results-by-segment table now bolds its Total row, same
  convention proposal-sow's Commercials table already used — previously only
  proposal-sow had this fix applied.

Regenerated all four references; each reports "Validation passed: no errors
found." with no style warnings.
</commit_message>
<xml_diff>
--- a/packages/desktop/resources/presentation-templates/business-report.docx
+++ b/packages/desktop/resources/presentation-templates/business-report.docx
@@ -421,29 +421,45 @@
       <w:tr>
         <w:trPr/>
         <w:tc>
-          <w:p>
-            <w:r>
+          <w:tcPr/>
+          <w:p>
+            <w:r>
+              <w:rPr>
+                <w:b/>
+              </w:rPr>
               <w:t xml:space="preserve">Total</w:t>
             </w:r>
           </w:p>
         </w:tc>
         <w:tc>
-          <w:p>
-            <w:r>
+          <w:tcPr/>
+          <w:p>
+            <w:r>
+              <w:rPr>
+                <w:b/>
+              </w:rPr>
               <w:t xml:space="preserve">696.7</w:t>
             </w:r>
           </w:p>
         </w:tc>
         <w:tc>
-          <w:p>
-            <w:r>
+          <w:tcPr/>
+          <w:p>
+            <w:r>
+              <w:rPr>
+                <w:b/>
+              </w:rPr>
               <w:t xml:space="preserve">+12%</w:t>
             </w:r>
           </w:p>
         </w:tc>
         <w:tc>
-          <w:p>
-            <w:r>
+          <w:tcPr/>
+          <w:p>
+            <w:r>
+              <w:rPr>
+                <w:b/>
+              </w:rPr>
               <w:t xml:space="preserve">31%</w:t>
             </w:r>
           </w:p>
@@ -600,12 +616,51 @@
       </w:r>
     </w:p>
     <w:sectPr>
+      <w:footerReference w:type="first" r:id="R3438ee44b9654092"/>
+      <w:footerReference w:type="default" r:id="R9145d2dfa0274568"/>
       <w:pgSz w:w="12240" w:h="15840"/>
       <w:pgMar w:top="1440" w:right="1440" w:bottom="1440" w:left="1440"/>
+      <w:titlePg/>
       <w:docGrid w:type="default"/>
     </w:sectPr>
   </w:body>
 </w:document>
+</file>
+
+<file path=word/footer1.xml><?xml version="1.0" encoding="utf-8"?>
+<w:ftr xmlns:mc="http://schemas.openxmlformats.org/markup-compatibility/2006" xmlns:w14="http://schemas.microsoft.com/office/word/2010/wordml" xmlns:w="http://schemas.openxmlformats.org/wordprocessingml/2006/main" mc:Ignorable="w14">
+  <w:p>
+    <w:pPr>
+      <w:jc w:val="center"/>
+    </w:pPr>
+    <w:r>
+      <w:fldChar w:fldCharType="begin"/>
+    </w:r>
+    <w:r>
+      <w:instrText xml:space="preserve"> PAGE </w:instrText>
+    </w:r>
+    <w:r>
+      <w:fldChar w:fldCharType="separate"/>
+    </w:r>
+    <w:r>
+      <w:t xml:space="preserve">1</w:t>
+    </w:r>
+    <w:r>
+      <w:fldChar w:fldCharType="end"/>
+    </w:r>
+  </w:p>
+</w:ftr>
+</file>
+
+<file path=word/footer2.xml><?xml version="1.0" encoding="utf-8"?>
+<w:ftr xmlns:mc="http://schemas.openxmlformats.org/markup-compatibility/2006" xmlns:w14="http://schemas.microsoft.com/office/word/2010/wordml" xmlns:w="http://schemas.openxmlformats.org/wordprocessingml/2006/main" mc:Ignorable="w14">
+  <w:p>
+    <w:pPr/>
+    <w:r>
+      <w:t xml:space="preserve"/>
+    </w:r>
+  </w:p>
+</w:ftr>
 </file>
 
 <file path=word/numbering.xml><?xml version="1.0" encoding="utf-8"?>

</xml_diff>

<commit_message>
fix(presentation-templates): correct business-report TOC page numbers
The Contents page listed pages 3, 4, 5, 6 for the four sections, but the
sections actually start on pages 3, 3, 3, 4. Confirmed via render before and
after the fix. Bumped the pack manifest version so existing users get the
corrected reference file.
</commit_message>
<xml_diff>
--- a/packages/desktop/resources/presentation-templates/business-report.docx
+++ b/packages/desktop/resources/presentation-templates/business-report.docx
@@ -119,7 +119,7 @@
         </w:rPr>
         <w:t xml:space="preserve">2. Operating Performance</w:t>
         <w:tab/>
-        <w:t xml:space="preserve">4</w:t>
+        <w:t xml:space="preserve">3</w:t>
       </w:r>
     </w:p>
     <w:p>
@@ -135,7 +135,7 @@
         </w:rPr>
         <w:t xml:space="preserve">3. Market Position</w:t>
         <w:tab/>
-        <w:t xml:space="preserve">5</w:t>
+        <w:t xml:space="preserve">3</w:t>
       </w:r>
     </w:p>
     <w:p>
@@ -151,7 +151,7 @@
         </w:rPr>
         <w:t xml:space="preserve">4. Outlook and Priorities</w:t>
         <w:tab/>
-        <w:t xml:space="preserve">6</w:t>
+        <w:t xml:space="preserve">4</w:t>
       </w:r>
     </w:p>
     <w:p>
@@ -616,8 +616,8 @@
       </w:r>
     </w:p>
     <w:sectPr>
-      <w:footerReference w:type="first" r:id="R3438ee44b9654092"/>
-      <w:footerReference w:type="default" r:id="R9145d2dfa0274568"/>
+      <w:footerReference w:type="first" r:id="R9713f2d8571e4e1b"/>
+      <w:footerReference w:type="default" r:id="R0f4cbd2e48f94d98"/>
       <w:pgSz w:w="12240" w:h="15840"/>
       <w:pgMar w:top="1440" w:right="1440" w:bottom="1440" w:left="1440"/>
       <w:titlePg/>

</xml_diff>